<commit_message>
Update Hospital IT Vendor Questionnaire to version 13; modify questionnaire version, enhance JSON schema, and refine UI options
</commit_message>
<xml_diff>
--- a/Hospital_IT_Vendor_Questionnaire_Questions.docx
+++ b/Hospital_IT_Vendor_Questionnaire_Questions.docx
@@ -94,7 +94,7 @@
         <ns0:ind ns0:left="369" ns0:hanging="198"/>
       </ns0:pPr>
       <ns0:r>
-        <ns0:t>•  B  Specialized clinical solution or modules</ns0:t>
+        <ns0:t>•  B  Specialized clinical solution / module</ns0:t>
       </ns0:r>
     </ns0:p>
     <ns0:p>
@@ -802,7 +802,7 @@
         <ns0:ind ns0:left="369" ns0:hanging="198"/>
       </ns0:pPr>
       <ns0:r>
-        <ns0:t>•  Yes, but only specific data/documents – please specify</ns0:t>
+        <ns0:t>•  Yes, but only specific data/documents</ns0:t>
       </ns0:r>
     </ns0:p>
     <ns0:p>
@@ -821,59 +821,6 @@
       </ns0:pPr>
       <ns0:r>
         <ns0:t>•  Not sure</ns0:t>
-      </ns0:r>
-    </ns0:p>
-    <ns0:p>
-      <ns0:pPr>
-        <ns0:spacing ns0:after="100"/>
-      </ns0:pPr>
-      <ns0:r>
-        <ns0:rPr>
-          <ns0:i/>
-          <ns0:color ns0:val="5C696E"/>
-          <ns0:sz ns0:val="17"/>
-        </ns0:rPr>
-        <ns0:t>If Yes or Yes, but only specific data/documents: Which patient/clinical information is persistently stored? Select all that apply.</ns0:t>
-      </ns0:r>
-    </ns0:p>
-    <ns0:p>
-      <ns0:pPr>
-        <ns0:spacing ns0:after="40"/>
-        <ns0:ind ns0:left="369" ns0:hanging="198"/>
-      </ns0:pPr>
-      <ns0:r>
-        <ns0:t>•  Individual clinical documents or diagnostic images</ns0:t>
-      </ns0:r>
-    </ns0:p>
-    <ns0:p>
-      <ns0:pPr>
-        <ns0:spacing ns0:after="40"/>
-        <ns0:ind ns0:left="369" ns0:hanging="198"/>
-      </ns0:pPr>
-      <ns0:r>
-        <ns0:t>•  An ongoing clinical record across encounters or over time</ns0:t>
-      </ns0:r>
-    </ns0:p>
-    <ns0:p>
-      <ns0:pPr>
-        <ns0:spacing ns0:after="40"/>
-        <ns0:ind ns0:left="369" ns0:hanging="198"/>
-      </ns0:pPr>
-      <ns0:r>
-        <ns0:t>•  Other patient/clinical data</ns0:t>
-      </ns0:r>
-    </ns0:p>
-    <ns0:p>
-      <ns0:pPr>
-        <ns0:spacing ns0:after="100"/>
-      </ns0:pPr>
-      <ns0:r>
-        <ns0:rPr>
-          <ns0:i/>
-          <ns0:color ns0:val="5C696E"/>
-          <ns0:sz ns0:val="17"/>
-        </ns0:rPr>
-        <ns0:t>If Yes, but only specific data/documents: specify which data/documents are stored.</ns0:t>
       </ns0:r>
     </ns0:p>
     <ns0:p>
@@ -1898,34 +1845,34 @@
         <ns0:ind ns0:left="369" ns0:hanging="198"/>
       </ns0:pPr>
       <ns0:r>
-        <ns0:t>•  No specific termination/exit fee</ns0:t>
-      </ns0:r>
-    </ns0:p>
-    <ns0:p>
-      <ns0:pPr>
-        <ns0:spacing ns0:after="40"/>
-        <ns0:ind ns0:left="369" ns0:hanging="198"/>
-      </ns0:pPr>
-      <ns0:r>
-        <ns0:t>•  Data extraction/export fee</ns0:t>
-      </ns0:r>
-    </ns0:p>
-    <ns0:p>
-      <ns0:pPr>
-        <ns0:spacing ns0:after="40"/>
-        <ns0:ind ns0:left="369" ns0:hanging="198"/>
-      </ns0:pPr>
-      <ns0:r>
-        <ns0:t>•  Vendor support for migration is charged separately</ns0:t>
-      </ns0:r>
-    </ns0:p>
-    <ns0:p>
-      <ns0:pPr>
-        <ns0:spacing ns0:after="40"/>
-        <ns0:ind ns0:left="369" ns0:hanging="198"/>
-      </ns0:pPr>
-      <ns0:r>
-        <ns0:t>•  Continued access/read-only access is charged separately</ns0:t>
+        <ns0:t>•  No specific termination/exit fees</ns0:t>
+      </ns0:r>
+    </ns0:p>
+    <ns0:p>
+      <ns0:pPr>
+        <ns0:spacing ns0:after="40"/>
+        <ns0:ind ns0:left="369" ns0:hanging="198"/>
+      </ns0:pPr>
+      <ns0:r>
+        <ns0:t>•  Data extraction/export fees</ns0:t>
+      </ns0:r>
+    </ns0:p>
+    <ns0:p>
+      <ns0:pPr>
+        <ns0:spacing ns0:after="40"/>
+        <ns0:ind ns0:left="369" ns0:hanging="198"/>
+      </ns0:pPr>
+      <ns0:r>
+        <ns0:t>•  Migration support fees</ns0:t>
+      </ns0:r>
+    </ns0:p>
+    <ns0:p>
+      <ns0:pPr>
+        <ns0:spacing ns0:after="40"/>
+        <ns0:ind ns0:left="369" ns0:hanging="198"/>
+      </ns0:pPr>
+      <ns0:r>
+        <ns0:t>•  Continued/read-only access fees</ns0:t>
       </ns0:r>
     </ns0:p>
     <ns0:p>
@@ -3126,7 +3073,7 @@
           <ns0:color ns0:val="5C696E"/>
           <ns0:sz ns0:val="17"/>
         </ns0:rPr>
-        <ns0:t>Shown when: Q6 is Yes or Yes, but only specific data/documents, and its stored-data checklist includes clinical documents/images or an ongoing clinical record.</ns0:t>
+        <ns0:t>Shown when: Q6 is Yes or Yes, but only specific data/documents.</ns0:t>
       </ns0:r>
     </ns0:p>
     <ns0:p>
@@ -3205,7 +3152,7 @@
           <ns0:color ns0:val="5C696E"/>
           <ns0:sz ns0:val="17"/>
         </ns0:rPr>
-        <ns0:t>Shown when: Q6 is Yes or Yes, but only specific data/documents, and its stored-data checklist includes an ongoing clinical record.</ns0:t>
+        <ns0:t>Shown when: Q6 is Yes.</ns0:t>
       </ns0:r>
     </ns0:p>
     <ns0:p>
@@ -3709,7 +3656,97 @@
         <ns0:ind ns0:left="369" ns0:hanging="198"/>
       </ns0:pPr>
       <ns0:r>
-        <ns0:t>•  Can be purchased and operated independently of a hospital-wide CIS: Yes or No</ns0:t>
+        <ns0:t>For Category A only: Can be purchased and operated independently of a hospital-wide CIS: Yes or No.</ns0:t>
+      </ns0:r>
+    </ns0:p>
+    <ns0:p>
+      <ns0:pPr>
+        <ns0:spacing ns0:after="40"/>
+        <ns0:ind ns0:left="369" ns0:hanging="198"/>
+      </ns0:pPr>
+      <ns0:r>
+        <ns0:t>For Category B: How does this solution typically relate to a hospital-wide CIS? Select one answer.</ns0:t>
+      </ns0:r>
+    </ns0:p>
+    <ns0:p>
+      <ns0:pPr>
+        <ns0:spacing ns0:after="40"/>
+        <ns0:ind ns0:left="369" ns0:hanging="198"/>
+      </ns0:pPr>
+      <ns0:r>
+        <ns0:t>•  Can operate independently of a specific hospital-wide CIS</ns0:t>
+      </ns0:r>
+    </ns0:p>
+    <ns0:p>
+      <ns0:pPr>
+        <ns0:spacing ns0:after="40"/>
+        <ns0:ind ns0:left="369" ns0:hanging="198"/>
+      </ns0:pPr>
+      <ns0:r>
+        <ns0:t>•  Requires integration with a hospital-wide CIS but is not tied to a specific CIS vendor</ns0:t>
+      </ns0:r>
+    </ns0:p>
+    <ns0:p>
+      <ns0:pPr>
+        <ns0:spacing ns0:after="40"/>
+        <ns0:ind ns0:left="369" ns0:hanging="198"/>
+      </ns0:pPr>
+      <ns0:r>
+        <ns0:t>•  Requires a specific CIS/platform</ns0:t>
+      </ns0:r>
+    </ns0:p>
+    <ns0:p>
+      <ns0:pPr>
+        <ns0:spacing ns0:after="40"/>
+        <ns0:ind ns0:left="369" ns0:hanging="198"/>
+      </ns0:pPr>
+      <ns0:r>
+        <ns0:t>•  Can be used either independently or integrated with a hospital-wide CIS</ns0:t>
+      </ns0:r>
+    </ns0:p>
+    <ns0:p>
+      <ns0:pPr>
+        <ns0:spacing ns0:after="40"/>
+        <ns0:ind ns0:left="369" ns0:hanging="198"/>
+      </ns0:pPr>
+      <ns0:r>
+        <ns0:t>•  Other – specify</ns0:t>
+      </ns0:r>
+    </ns0:p>
+    <ns0:p>
+      <ns0:pPr>
+        <ns0:spacing ns0:after="40"/>
+        <ns0:ind ns0:left="369" ns0:hanging="198"/>
+      </ns0:pPr>
+      <ns0:r>
+        <ns0:t>For Category B: Is the solution typically integrated with a hospital-wide CIS? Select one answer.</ns0:t>
+      </ns0:r>
+    </ns0:p>
+    <ns0:p>
+      <ns0:pPr>
+        <ns0:spacing ns0:after="40"/>
+        <ns0:ind ns0:left="369" ns0:hanging="198"/>
+      </ns0:pPr>
+      <ns0:r>
+        <ns0:t>•  Yes</ns0:t>
+      </ns0:r>
+    </ns0:p>
+    <ns0:p>
+      <ns0:pPr>
+        <ns0:spacing ns0:after="40"/>
+        <ns0:ind ns0:left="369" ns0:hanging="198"/>
+      </ns0:pPr>
+      <ns0:r>
+        <ns0:t>•  Optional / depends on implementation</ns0:t>
+      </ns0:r>
+    </ns0:p>
+    <ns0:p>
+      <ns0:pPr>
+        <ns0:spacing ns0:after="40"/>
+        <ns0:ind ns0:left="369" ns0:hanging="198"/>
+      </ns0:pPr>
+      <ns0:r>
+        <ns0:t>•  No</ns0:t>
       </ns0:r>
     </ns0:p>
     <ns0:p>
@@ -3722,25 +3759,25 @@
           <ns0:color ns0:val="5C696E"/>
           <ns0:sz ns0:val="17"/>
         </ns0:rPr>
-        <ns0:t>Workflow integration with the CIS. Asked for each specialized function and external integration.</ns0:t>
-      </ns0:r>
-    </ns0:p>
-    <ns0:p>
-      <ns0:pPr>
-        <ns0:spacing ns0:after="40"/>
-        <ns0:ind ns0:left="369" ns0:hanging="198"/>
-      </ns0:pPr>
-      <ns0:r>
-        <ns0:t>•  Which data already in the CIS does this offering reuse? Patient details; medication data; laboratory results; Other (specify); none of these; not sure.</ns0:t>
-      </ns0:r>
-    </ns0:p>
-    <ns0:p>
-      <ns0:pPr>
-        <ns0:spacing ns0:after="40"/>
-        <ns0:ind ns0:left="369" ns0:hanging="198"/>
-      </ns0:pPr>
-      <ns0:r>
-        <ns0:t>•  Is information written back to the CIS? Automatically; only after a user action; manual transfer or duplicate entry; no information is written back; not sure or not applicable.</ns0:t>
+        <ns0:t>Workflow integration with the connected CIS. Asked for each external integration and Category A-only specialized function. For Category B specialized functions, shown only when typical integration is Yes or Optional / depends on implementation.</ns0:t>
+      </ns0:r>
+    </ns0:p>
+    <ns0:p>
+      <ns0:pPr>
+        <ns0:spacing ns0:after="40"/>
+        <ns0:ind ns0:left="369" ns0:hanging="198"/>
+      </ns0:pPr>
+      <ns0:r>
+        <ns0:t>•  Which data already in the connected CIS does this offering reuse? Patient details; medication data; laboratory results; Other (specify); none of these; not sure.</ns0:t>
+      </ns0:r>
+    </ns0:p>
+    <ns0:p>
+      <ns0:pPr>
+        <ns0:spacing ns0:after="40"/>
+        <ns0:ind ns0:left="369" ns0:hanging="198"/>
+      </ns0:pPr>
+      <ns0:r>
+        <ns0:t>•  Is information written back to the connected CIS? Automatically; only after a user action; manual transfer or duplicate entry; no information is written back; not sure or not applicable.</ns0:t>
       </ns0:r>
     </ns0:p>
     <ns0:p>
@@ -4727,16 +4764,20 @@
         <ns0:ind ns0:left="369" ns0:hanging="198"/>
       </ns0:pPr>
       <ns0:r>
-        <ns0:t>•  No – requires the vendor’s CIS</ns0:t>
-      </ns0:r>
-    </ns0:p>
-    <ns0:p>
-      <ns0:pPr>
-        <ns0:spacing ns0:after="40"/>
-        <ns0:ind ns0:left="369" ns0:hanging="198"/>
-      </ns0:pPr>
-      <ns0:r>
-        <ns0:t>•  No – requires another specific CIS/platform</ns0:t>
+        <ns0:t>•  No, requires a specific CIS – please specify</ns0:t>
+      </ns0:r>
+    </ns0:p>
+    <ns0:p>
+      <ns0:pPr>
+        <ns0:spacing ns0:after="100"/>
+      </ns0:pPr>
+      <ns0:r>
+        <ns0:rPr>
+          <ns0:i/>
+          <ns0:color ns0:val="5C696E"/>
+          <ns0:sz ns0:val="17"/>
+        </ns0:rPr>
+        <ns0:t>If No: specify the required CIS in the free-text field.</ns0:t>
       </ns0:r>
     </ns0:p>
     <ns0:p>

</xml_diff>

<commit_message>
Implement product intead of solution filtering in analysis; update UI for questionnaire responses and modify some vendor names
</commit_message>
<xml_diff>
--- a/Hospital_IT_Vendor_Questionnaire_Questions.docx
+++ b/Hospital_IT_Vendor_Questionnaire_Questions.docx
@@ -5257,6 +5257,7 @@
     <ns0:p>
       <ns0:pPr>
         <ns0:pStyle ns0:val="Heading1"/>
+        <ns0:pageBreakBefore/>
       </ns0:pPr>
       <ns0:r>
         <ns0:t>2.10 Integration Requirements</ns0:t>
@@ -5334,15 +5335,6 @@
       </ns0:pPr>
       <ns0:r>
         <ns0:t>•  Integration with CIS/HIS</ns0:t>
-      </ns0:r>
-    </ns0:p>
-    <ns0:p>
-      <ns0:pPr>
-        <ns0:spacing ns0:after="40"/>
-        <ns0:ind ns0:left="369" ns0:hanging="198"/>
-      </ns0:pPr>
-      <ns0:r>
-        <ns0:t>•  Integration with patient administration/ADT</ns0:t>
       </ns0:r>
     </ns0:p>
     <ns0:p>

</xml_diff>